<commit_message>
Suppression des dossiers data et scripts vides
</commit_message>
<xml_diff>
--- a/economic-growth-panel-data-analysis.docx
+++ b/economic-growth-panel-data-analysis.docx
@@ -3,6 +3,9 @@
 <w:document xmlns:wpc="http://schemas.microsoft.com/office/word/2010/wordprocessingCanvas" xmlns:cx="http://schemas.microsoft.com/office/drawing/2014/chartex" xmlns:cx1="http://schemas.microsoft.com/office/drawing/2015/9/8/chartex" xmlns:mc="http://schemas.openxmlformats.org/markup-compatibility/2006" xmlns:o="urn:schemas-microsoft-com:office:office" xmlns:r="http://schemas.openxmlformats.org/officeDocument/2006/relationships" xmlns:m="http://schemas.openxmlformats.org/officeDocument/2006/math" xmlns:v="urn:schemas-microsoft-com:vml" xmlns:wp14="http://schemas.microsoft.com/office/word/2010/wordprocessingDrawing" xmlns:wp="http://schemas.openxmlformats.org/drawingml/2006/wordprocessingDrawing" xmlns:w10="urn:schemas-microsoft-com:office:word" xmlns:w="http://schemas.openxmlformats.org/wordprocessingml/2006/main" xmlns:w14="http://schemas.microsoft.com/office/word/2010/wordml" xmlns:w15="http://schemas.microsoft.com/office/word/2012/wordml" xmlns:w16se="http://schemas.microsoft.com/office/word/2015/wordml/symex" xmlns:wpg="http://schemas.microsoft.com/office/word/2010/wordprocessingGroup" xmlns:wpi="http://schemas.microsoft.com/office/word/2010/wordprocessingInk" xmlns:wne="http://schemas.microsoft.com/office/word/2006/wordml" xmlns:wps="http://schemas.microsoft.com/office/word/2010/wordprocessingShape" mc:Ignorable="w14 w15 w16se wp14">
   <w:body>
     <w:p>
+      <w:pPr>
+        <w:jc w:val="both"/>
+      </w:pPr>
       <w:r>
         <w:rPr>
           <w:noProof/>
@@ -114,15 +117,50 @@
         <w:t xml:space="preserve">                                                                     </w:t>
       </w:r>
     </w:p>
-    <w:p/>
-    <w:p/>
-    <w:p/>
-    <w:p/>
-    <w:p/>
-    <w:p/>
-    <w:p/>
-    <w:p/>
-    <w:p>
+    <w:p>
+      <w:pPr>
+        <w:jc w:val="both"/>
+      </w:pPr>
+    </w:p>
+    <w:p>
+      <w:pPr>
+        <w:jc w:val="both"/>
+      </w:pPr>
+    </w:p>
+    <w:p>
+      <w:pPr>
+        <w:jc w:val="both"/>
+      </w:pPr>
+    </w:p>
+    <w:p>
+      <w:pPr>
+        <w:jc w:val="both"/>
+      </w:pPr>
+    </w:p>
+    <w:p>
+      <w:pPr>
+        <w:jc w:val="both"/>
+      </w:pPr>
+    </w:p>
+    <w:p>
+      <w:pPr>
+        <w:jc w:val="both"/>
+      </w:pPr>
+    </w:p>
+    <w:p>
+      <w:pPr>
+        <w:jc w:val="both"/>
+      </w:pPr>
+    </w:p>
+    <w:p>
+      <w:pPr>
+        <w:jc w:val="both"/>
+      </w:pPr>
+    </w:p>
+    <w:p>
+      <w:pPr>
+        <w:jc w:val="both"/>
+      </w:pPr>
       <w:r>
         <w:rPr>
           <w:noProof/>
@@ -290,41 +328,57 @@
         </mc:AlternateContent>
       </w:r>
     </w:p>
-    <w:p/>
-    <w:p/>
-    <w:p/>
-    <w:p>
-      <w:pPr>
-        <w:jc w:val="right"/>
-      </w:pPr>
-    </w:p>
-    <w:p>
-      <w:pPr>
-        <w:jc w:val="right"/>
-      </w:pPr>
-    </w:p>
-    <w:p>
-      <w:pPr>
-        <w:jc w:val="right"/>
-      </w:pPr>
-    </w:p>
-    <w:p>
-      <w:pPr>
-        <w:jc w:val="right"/>
-      </w:pPr>
-    </w:p>
-    <w:p>
-      <w:pPr>
-        <w:jc w:val="right"/>
-      </w:pPr>
-    </w:p>
-    <w:p/>
+    <w:p>
+      <w:pPr>
+        <w:jc w:val="both"/>
+      </w:pPr>
+    </w:p>
+    <w:p>
+      <w:pPr>
+        <w:jc w:val="both"/>
+      </w:pPr>
+    </w:p>
+    <w:p>
+      <w:pPr>
+        <w:jc w:val="both"/>
+      </w:pPr>
+    </w:p>
+    <w:p>
+      <w:pPr>
+        <w:jc w:val="both"/>
+      </w:pPr>
+    </w:p>
+    <w:p>
+      <w:pPr>
+        <w:jc w:val="both"/>
+      </w:pPr>
+    </w:p>
+    <w:p>
+      <w:pPr>
+        <w:jc w:val="both"/>
+      </w:pPr>
+    </w:p>
+    <w:p>
+      <w:pPr>
+        <w:jc w:val="both"/>
+      </w:pPr>
+    </w:p>
+    <w:p>
+      <w:pPr>
+        <w:jc w:val="both"/>
+      </w:pPr>
+    </w:p>
+    <w:p>
+      <w:pPr>
+        <w:jc w:val="both"/>
+      </w:pPr>
+    </w:p>
     <w:p>
       <w:pPr>
         <w:tabs>
           <w:tab w:val="left" w:pos="6053"/>
         </w:tabs>
-        <w:jc w:val="center"/>
+        <w:jc w:val="both"/>
         <w:rPr>
           <w:rFonts w:ascii="Times New Roman" w:hAnsi="Times New Roman" w:cs="Times New Roman"/>
           <w:sz w:val="24"/>
@@ -366,19 +420,24 @@
       </w:r>
     </w:p>
     <w:bookmarkEnd w:id="0"/>
-    <w:p/>
-    <w:p>
-      <w:pPr>
-        <w:jc w:val="right"/>
-      </w:pPr>
-    </w:p>
-    <w:p>
-      <w:pPr>
-        <w:jc w:val="right"/>
-      </w:pPr>
-    </w:p>
-    <w:p>
-      <w:pPr>
+    <w:p>
+      <w:pPr>
+        <w:jc w:val="both"/>
+      </w:pPr>
+    </w:p>
+    <w:p>
+      <w:pPr>
+        <w:jc w:val="both"/>
+      </w:pPr>
+    </w:p>
+    <w:p>
+      <w:pPr>
+        <w:jc w:val="both"/>
+      </w:pPr>
+    </w:p>
+    <w:p>
+      <w:pPr>
+        <w:jc w:val="both"/>
         <w:rPr>
           <w:rFonts w:ascii="Times New Roman" w:hAnsi="Times New Roman" w:cs="Times New Roman"/>
           <w:sz w:val="24"/>
@@ -620,6 +679,7 @@
     </w:p>
     <w:p>
       <w:pPr>
+        <w:jc w:val="both"/>
         <w:rPr>
           <w:rFonts w:ascii="Times New Roman" w:hAnsi="Times New Roman" w:cs="Times New Roman"/>
           <w:b/>
@@ -708,8 +768,6 @@
             </w:rPr>
             <w:t>Table des matières</w:t>
           </w:r>
-          <w:bookmarkStart w:id="2" w:name="_GoBack"/>
-          <w:bookmarkEnd w:id="2"/>
         </w:p>
         <w:p>
           <w:pPr>
@@ -944,7 +1002,7 @@
                 <w:sz w:val="24"/>
                 <w:szCs w:val="24"/>
               </w:rPr>
-              <w:t>4</w:t>
+              <w:t>7</w:t>
             </w:r>
             <w:r>
               <w:rPr>
@@ -1064,7 +1122,7 @@
                 <w:sz w:val="24"/>
                 <w:szCs w:val="24"/>
               </w:rPr>
-              <w:t>4</w:t>
+              <w:t>7</w:t>
             </w:r>
             <w:r>
               <w:rPr>
@@ -1183,7 +1241,7 @@
                 <w:sz w:val="24"/>
                 <w:szCs w:val="24"/>
               </w:rPr>
-              <w:t>4</w:t>
+              <w:t>7</w:t>
             </w:r>
             <w:r>
               <w:rPr>
@@ -1302,7 +1360,7 @@
                 <w:sz w:val="24"/>
                 <w:szCs w:val="24"/>
               </w:rPr>
-              <w:t>5</w:t>
+              <w:t>8</w:t>
             </w:r>
             <w:r>
               <w:rPr>
@@ -1421,7 +1479,7 @@
                 <w:sz w:val="24"/>
                 <w:szCs w:val="24"/>
               </w:rPr>
-              <w:t>6</w:t>
+              <w:t>8</w:t>
             </w:r>
             <w:r>
               <w:rPr>
@@ -1572,7 +1630,7 @@
                 <w:sz w:val="24"/>
                 <w:szCs w:val="24"/>
               </w:rPr>
-              <w:t>6</w:t>
+              <w:t>9</w:t>
             </w:r>
             <w:r>
               <w:rPr>
@@ -1712,7 +1770,7 @@
                 <w:sz w:val="24"/>
                 <w:szCs w:val="24"/>
               </w:rPr>
-              <w:t>7</w:t>
+              <w:t>10</w:t>
             </w:r>
             <w:r>
               <w:rPr>
@@ -1845,7 +1903,7 @@
                 <w:sz w:val="24"/>
                 <w:szCs w:val="24"/>
               </w:rPr>
-              <w:t>8</w:t>
+              <w:t>10</w:t>
             </w:r>
             <w:r>
               <w:rPr>
@@ -1976,7 +2034,7 @@
                 <w:sz w:val="24"/>
                 <w:szCs w:val="24"/>
               </w:rPr>
-              <w:t>8</w:t>
+              <w:t>10</w:t>
             </w:r>
             <w:r>
               <w:rPr>
@@ -2095,7 +2153,7 @@
                 <w:sz w:val="24"/>
                 <w:szCs w:val="24"/>
               </w:rPr>
-              <w:t>8</w:t>
+              <w:t>10</w:t>
             </w:r>
             <w:r>
               <w:rPr>
@@ -2216,7 +2274,7 @@
                 <w:sz w:val="24"/>
                 <w:szCs w:val="24"/>
               </w:rPr>
-              <w:t>9</w:t>
+              <w:t>11</w:t>
             </w:r>
             <w:r>
               <w:rPr>
@@ -2335,7 +2393,7 @@
                 <w:sz w:val="24"/>
                 <w:szCs w:val="24"/>
               </w:rPr>
-              <w:t>9</w:t>
+              <w:t>11</w:t>
             </w:r>
             <w:r>
               <w:rPr>
@@ -2454,7 +2512,7 @@
                 <w:sz w:val="24"/>
                 <w:szCs w:val="24"/>
               </w:rPr>
-              <w:t>9</w:t>
+              <w:t>11</w:t>
             </w:r>
             <w:r>
               <w:rPr>
@@ -2573,7 +2631,7 @@
                 <w:sz w:val="24"/>
                 <w:szCs w:val="24"/>
               </w:rPr>
-              <w:t>10</w:t>
+              <w:t>12</w:t>
             </w:r>
             <w:r>
               <w:rPr>
@@ -2692,7 +2750,7 @@
                 <w:sz w:val="24"/>
                 <w:szCs w:val="24"/>
               </w:rPr>
-              <w:t>11</w:t>
+              <w:t>12</w:t>
             </w:r>
             <w:r>
               <w:rPr>
@@ -2811,7 +2869,7 @@
                 <w:sz w:val="24"/>
                 <w:szCs w:val="24"/>
               </w:rPr>
-              <w:t>11</w:t>
+              <w:t>12</w:t>
             </w:r>
             <w:r>
               <w:rPr>
@@ -2930,7 +2988,7 @@
                 <w:sz w:val="24"/>
                 <w:szCs w:val="24"/>
               </w:rPr>
-              <w:t>12</w:t>
+              <w:t>13</w:t>
             </w:r>
             <w:r>
               <w:rPr>
@@ -3070,7 +3128,7 @@
                 <w:sz w:val="24"/>
                 <w:szCs w:val="24"/>
               </w:rPr>
-              <w:t>12</w:t>
+              <w:t>13</w:t>
             </w:r>
             <w:r>
               <w:rPr>
@@ -3189,7 +3247,7 @@
                 <w:sz w:val="24"/>
                 <w:szCs w:val="24"/>
               </w:rPr>
-              <w:t>12</w:t>
+              <w:t>13</w:t>
             </w:r>
             <w:r>
               <w:rPr>
@@ -3287,7 +3345,7 @@
                 <w:sz w:val="24"/>
                 <w:szCs w:val="24"/>
               </w:rPr>
-              <w:t>13</w:t>
+              <w:t>14</w:t>
             </w:r>
             <w:r>
               <w:rPr>
@@ -3357,7 +3415,7 @@
           <w:szCs w:val="24"/>
         </w:rPr>
       </w:pPr>
-      <w:bookmarkStart w:id="3" w:name="_Toc134556625"/>
+      <w:bookmarkStart w:id="2" w:name="_Toc134556625"/>
     </w:p>
     <w:p>
       <w:pPr>
@@ -3492,7 +3550,7 @@
             <w:sz w:val="24"/>
             <w:szCs w:val="24"/>
           </w:rPr>
-          <w:t>5</w:t>
+          <w:t>7</w:t>
         </w:r>
         <w:r>
           <w:rPr>
@@ -3636,7 +3694,7 @@
             <w:sz w:val="24"/>
             <w:szCs w:val="24"/>
           </w:rPr>
-          <w:t>6</w:t>
+          <w:t>7</w:t>
         </w:r>
         <w:r>
           <w:rPr>
@@ -3780,7 +3838,7 @@
             <w:sz w:val="24"/>
             <w:szCs w:val="24"/>
           </w:rPr>
-          <w:t>6</w:t>
+          <w:t>7</w:t>
         </w:r>
         <w:r>
           <w:rPr>
@@ -3924,7 +3982,7 @@
             <w:sz w:val="24"/>
             <w:szCs w:val="24"/>
           </w:rPr>
-          <w:t>6</w:t>
+          <w:t>7</w:t>
         </w:r>
         <w:r>
           <w:rPr>
@@ -4068,7 +4126,7 @@
             <w:sz w:val="24"/>
             <w:szCs w:val="24"/>
           </w:rPr>
-          <w:t>7</w:t>
+          <w:t>8</w:t>
         </w:r>
         <w:r>
           <w:rPr>
@@ -4484,7 +4542,7 @@
             <w:sz w:val="24"/>
             <w:szCs w:val="24"/>
           </w:rPr>
-          <w:t>7</w:t>
+          <w:t>8</w:t>
         </w:r>
         <w:r>
           <w:rPr>
@@ -4628,7 +4686,7 @@
             <w:sz w:val="24"/>
             <w:szCs w:val="24"/>
           </w:rPr>
-          <w:t>7</w:t>
+          <w:t>9</w:t>
         </w:r>
         <w:r>
           <w:rPr>
@@ -4772,7 +4830,7 @@
             <w:sz w:val="24"/>
             <w:szCs w:val="24"/>
           </w:rPr>
-          <w:t>10</w:t>
+          <w:t>11</w:t>
         </w:r>
         <w:r>
           <w:rPr>
@@ -4952,127 +5010,147 @@
     <w:p>
       <w:pPr>
         <w:spacing w:line="276" w:lineRule="auto"/>
-        <w:rPr>
-          <w:rFonts w:ascii="Times New Roman" w:hAnsi="Times New Roman" w:cs="Times New Roman"/>
-          <w:sz w:val="24"/>
-          <w:szCs w:val="24"/>
-        </w:rPr>
-      </w:pPr>
-    </w:p>
-    <w:p>
-      <w:pPr>
-        <w:spacing w:line="276" w:lineRule="auto"/>
-        <w:rPr>
-          <w:rFonts w:ascii="Times New Roman" w:hAnsi="Times New Roman" w:cs="Times New Roman"/>
-          <w:sz w:val="24"/>
-          <w:szCs w:val="24"/>
-        </w:rPr>
-      </w:pPr>
-    </w:p>
-    <w:p>
-      <w:pPr>
-        <w:spacing w:line="276" w:lineRule="auto"/>
-        <w:rPr>
-          <w:rFonts w:ascii="Times New Roman" w:hAnsi="Times New Roman" w:cs="Times New Roman"/>
-          <w:sz w:val="24"/>
-          <w:szCs w:val="24"/>
-        </w:rPr>
-      </w:pPr>
-    </w:p>
-    <w:p>
-      <w:pPr>
-        <w:spacing w:line="276" w:lineRule="auto"/>
-        <w:rPr>
-          <w:rFonts w:ascii="Times New Roman" w:hAnsi="Times New Roman" w:cs="Times New Roman"/>
-          <w:sz w:val="24"/>
-          <w:szCs w:val="24"/>
-        </w:rPr>
-      </w:pPr>
-    </w:p>
-    <w:p>
-      <w:pPr>
-        <w:spacing w:line="276" w:lineRule="auto"/>
-        <w:rPr>
-          <w:rFonts w:ascii="Times New Roman" w:hAnsi="Times New Roman" w:cs="Times New Roman"/>
-          <w:sz w:val="24"/>
-          <w:szCs w:val="24"/>
-        </w:rPr>
-      </w:pPr>
-    </w:p>
-    <w:p>
-      <w:pPr>
-        <w:spacing w:line="276" w:lineRule="auto"/>
-      </w:pPr>
-    </w:p>
-    <w:p>
-      <w:pPr>
-        <w:spacing w:line="276" w:lineRule="auto"/>
-      </w:pPr>
-    </w:p>
-    <w:p>
-      <w:pPr>
-        <w:spacing w:line="276" w:lineRule="auto"/>
-      </w:pPr>
-    </w:p>
-    <w:p>
-      <w:pPr>
-        <w:spacing w:line="276" w:lineRule="auto"/>
-      </w:pPr>
-    </w:p>
-    <w:p>
-      <w:pPr>
-        <w:spacing w:line="276" w:lineRule="auto"/>
-      </w:pPr>
-    </w:p>
-    <w:p>
-      <w:pPr>
-        <w:spacing w:line="276" w:lineRule="auto"/>
-      </w:pPr>
-    </w:p>
-    <w:p>
-      <w:pPr>
-        <w:spacing w:line="276" w:lineRule="auto"/>
-      </w:pPr>
-    </w:p>
-    <w:p>
-      <w:pPr>
-        <w:spacing w:line="276" w:lineRule="auto"/>
-      </w:pPr>
-    </w:p>
-    <w:p>
-      <w:pPr>
-        <w:spacing w:line="276" w:lineRule="auto"/>
-      </w:pPr>
-    </w:p>
-    <w:p>
-      <w:pPr>
-        <w:spacing w:line="276" w:lineRule="auto"/>
-      </w:pPr>
-    </w:p>
-    <w:p>
-      <w:pPr>
-        <w:spacing w:line="276" w:lineRule="auto"/>
-      </w:pPr>
-    </w:p>
-    <w:p>
-      <w:pPr>
-        <w:spacing w:line="276" w:lineRule="auto"/>
-      </w:pPr>
-    </w:p>
-    <w:p>
-      <w:pPr>
-        <w:spacing w:line="276" w:lineRule="auto"/>
-      </w:pPr>
-    </w:p>
-    <w:p>
-      <w:pPr>
-        <w:spacing w:line="276" w:lineRule="auto"/>
+        <w:jc w:val="both"/>
+        <w:rPr>
+          <w:rFonts w:ascii="Times New Roman" w:hAnsi="Times New Roman" w:cs="Times New Roman"/>
+          <w:sz w:val="24"/>
+          <w:szCs w:val="24"/>
+        </w:rPr>
+      </w:pPr>
+    </w:p>
+    <w:p>
+      <w:pPr>
+        <w:spacing w:line="276" w:lineRule="auto"/>
+        <w:jc w:val="both"/>
+        <w:rPr>
+          <w:rFonts w:ascii="Times New Roman" w:hAnsi="Times New Roman" w:cs="Times New Roman"/>
+          <w:sz w:val="24"/>
+          <w:szCs w:val="24"/>
+        </w:rPr>
+      </w:pPr>
+    </w:p>
+    <w:p>
+      <w:pPr>
+        <w:spacing w:line="276" w:lineRule="auto"/>
+        <w:jc w:val="both"/>
+        <w:rPr>
+          <w:rFonts w:ascii="Times New Roman" w:hAnsi="Times New Roman" w:cs="Times New Roman"/>
+          <w:sz w:val="24"/>
+          <w:szCs w:val="24"/>
+        </w:rPr>
+      </w:pPr>
+    </w:p>
+    <w:p>
+      <w:pPr>
+        <w:spacing w:line="276" w:lineRule="auto"/>
+        <w:jc w:val="both"/>
+        <w:rPr>
+          <w:rFonts w:ascii="Times New Roman" w:hAnsi="Times New Roman" w:cs="Times New Roman"/>
+          <w:sz w:val="24"/>
+          <w:szCs w:val="24"/>
+        </w:rPr>
+      </w:pPr>
+    </w:p>
+    <w:p>
+      <w:pPr>
+        <w:spacing w:line="276" w:lineRule="auto"/>
+        <w:jc w:val="both"/>
+        <w:rPr>
+          <w:rFonts w:ascii="Times New Roman" w:hAnsi="Times New Roman" w:cs="Times New Roman"/>
+          <w:sz w:val="24"/>
+          <w:szCs w:val="24"/>
+        </w:rPr>
+      </w:pPr>
+    </w:p>
+    <w:p>
+      <w:pPr>
+        <w:spacing w:line="276" w:lineRule="auto"/>
+        <w:jc w:val="both"/>
+      </w:pPr>
+    </w:p>
+    <w:p>
+      <w:pPr>
+        <w:spacing w:line="276" w:lineRule="auto"/>
+        <w:jc w:val="both"/>
+      </w:pPr>
+    </w:p>
+    <w:p>
+      <w:pPr>
+        <w:spacing w:line="276" w:lineRule="auto"/>
+        <w:jc w:val="both"/>
+      </w:pPr>
+    </w:p>
+    <w:p>
+      <w:pPr>
+        <w:spacing w:line="276" w:lineRule="auto"/>
+        <w:jc w:val="both"/>
+      </w:pPr>
+    </w:p>
+    <w:p>
+      <w:pPr>
+        <w:spacing w:line="276" w:lineRule="auto"/>
+        <w:jc w:val="both"/>
+      </w:pPr>
+    </w:p>
+    <w:p>
+      <w:pPr>
+        <w:spacing w:line="276" w:lineRule="auto"/>
+        <w:jc w:val="both"/>
+      </w:pPr>
+    </w:p>
+    <w:p>
+      <w:pPr>
+        <w:spacing w:line="276" w:lineRule="auto"/>
+        <w:jc w:val="both"/>
+      </w:pPr>
+    </w:p>
+    <w:p>
+      <w:pPr>
+        <w:spacing w:line="276" w:lineRule="auto"/>
+        <w:jc w:val="both"/>
+      </w:pPr>
+    </w:p>
+    <w:p>
+      <w:pPr>
+        <w:spacing w:line="276" w:lineRule="auto"/>
+        <w:jc w:val="both"/>
+      </w:pPr>
+    </w:p>
+    <w:p>
+      <w:pPr>
+        <w:spacing w:line="276" w:lineRule="auto"/>
+        <w:jc w:val="both"/>
+      </w:pPr>
+    </w:p>
+    <w:p>
+      <w:pPr>
+        <w:spacing w:line="276" w:lineRule="auto"/>
+        <w:jc w:val="both"/>
+      </w:pPr>
+    </w:p>
+    <w:p>
+      <w:pPr>
+        <w:spacing w:line="276" w:lineRule="auto"/>
+        <w:jc w:val="both"/>
+      </w:pPr>
+    </w:p>
+    <w:p>
+      <w:pPr>
+        <w:spacing w:line="276" w:lineRule="auto"/>
+        <w:jc w:val="both"/>
+      </w:pPr>
+    </w:p>
+    <w:p>
+      <w:pPr>
+        <w:spacing w:line="276" w:lineRule="auto"/>
+        <w:jc w:val="both"/>
       </w:pPr>
     </w:p>
     <w:p>
       <w:pPr>
         <w:pStyle w:val="Titre1"/>
         <w:spacing w:line="276" w:lineRule="auto"/>
+        <w:jc w:val="both"/>
         <w:rPr>
           <w:b/>
           <w:bCs/>
@@ -5088,7 +5166,7 @@
         <w:lastRenderedPageBreak/>
         <w:t>Introduction :</w:t>
       </w:r>
-      <w:bookmarkEnd w:id="3"/>
+      <w:bookmarkEnd w:id="2"/>
     </w:p>
     <w:p>
       <w:pPr>
@@ -5644,7 +5722,7 @@
           <w:szCs w:val="24"/>
         </w:rPr>
       </w:pPr>
-      <w:bookmarkStart w:id="4" w:name="_Hlk134556161"/>
+      <w:bookmarkStart w:id="3" w:name="_Hlk134556161"/>
       <w:r>
         <w:rPr>
           <w:rFonts w:ascii="Times New Roman" w:hAnsi="Times New Roman" w:cs="Times New Roman"/>
@@ -5684,7 +5762,7 @@
         </w:rPr>
         <w:t xml:space="preserve">Variable dépendante : </w:t>
       </w:r>
-      <w:bookmarkStart w:id="5" w:name="_Hlk134556162"/>
+      <w:bookmarkStart w:id="4" w:name="_Hlk134556162"/>
       <w:r>
         <w:rPr>
           <w:rFonts w:ascii="Times New Roman" w:hAnsi="Times New Roman" w:cs="Times New Roman"/>
@@ -5694,6 +5772,135 @@
         </w:rPr>
         <w:t xml:space="preserve">Taux de croissance du PIB par tête </w:t>
       </w:r>
+      <w:bookmarkEnd w:id="4"/>
+      <w:r>
+        <w:rPr>
+          <w:rFonts w:ascii="Times New Roman" w:hAnsi="Times New Roman" w:cs="Times New Roman"/>
+          <w:bCs/>
+          <w:sz w:val="24"/>
+          <w:szCs w:val="24"/>
+        </w:rPr>
+        <w:t>(TCPIBRtete)</w:t>
+      </w:r>
+    </w:p>
+    <w:p>
+      <w:pPr>
+        <w:spacing w:line="276" w:lineRule="auto"/>
+        <w:jc w:val="both"/>
+        <w:rPr>
+          <w:rFonts w:ascii="Times New Roman" w:hAnsi="Times New Roman" w:cs="Times New Roman"/>
+          <w:bCs/>
+          <w:sz w:val="24"/>
+          <w:szCs w:val="24"/>
+        </w:rPr>
+      </w:pPr>
+      <w:r>
+        <w:rPr>
+          <w:rFonts w:ascii="Times New Roman" w:hAnsi="Times New Roman" w:cs="Times New Roman"/>
+          <w:bCs/>
+          <w:sz w:val="24"/>
+          <w:szCs w:val="24"/>
+        </w:rPr>
+        <w:t>Variables indépendantes : Taux de croissance annuelle par population (TC</w:t>
+      </w:r>
+      <w:r>
+        <w:rPr>
+          <w:rFonts w:ascii="Times New Roman" w:hAnsi="Times New Roman" w:cs="Times New Roman"/>
+          <w:bCs/>
+          <w:sz w:val="24"/>
+          <w:szCs w:val="24"/>
+        </w:rPr>
+        <w:t>A</w:t>
+      </w:r>
+      <w:r>
+        <w:rPr>
+          <w:rFonts w:ascii="Times New Roman" w:hAnsi="Times New Roman" w:cs="Times New Roman"/>
+          <w:bCs/>
+          <w:sz w:val="24"/>
+          <w:szCs w:val="24"/>
+        </w:rPr>
+        <w:t xml:space="preserve">nnPop), la part de l’Exportation </w:t>
+      </w:r>
+      <w:r>
+        <w:rPr>
+          <w:rFonts w:ascii="Times New Roman" w:hAnsi="Times New Roman" w:cs="Times New Roman"/>
+          <w:bCs/>
+          <w:sz w:val="24"/>
+          <w:szCs w:val="24"/>
+        </w:rPr>
+        <w:t>sur</w:t>
+      </w:r>
+      <w:r>
+        <w:rPr>
+          <w:rFonts w:ascii="Times New Roman" w:hAnsi="Times New Roman" w:cs="Times New Roman"/>
+          <w:bCs/>
+          <w:sz w:val="24"/>
+          <w:szCs w:val="24"/>
+        </w:rPr>
+        <w:t xml:space="preserve"> le </w:t>
+      </w:r>
+      <w:r>
+        <w:rPr>
+          <w:rFonts w:ascii="Times New Roman" w:hAnsi="Times New Roman" w:cs="Times New Roman"/>
+          <w:bCs/>
+          <w:sz w:val="24"/>
+          <w:szCs w:val="24"/>
+        </w:rPr>
+        <w:t>PIB (</w:t>
+      </w:r>
+      <w:r>
+        <w:rPr>
+          <w:rFonts w:ascii="Times New Roman" w:hAnsi="Times New Roman" w:cs="Times New Roman"/>
+          <w:bCs/>
+          <w:sz w:val="24"/>
+          <w:szCs w:val="24"/>
+        </w:rPr>
+        <w:t>EXPPIB)</w:t>
+      </w:r>
+      <w:r>
+        <w:rPr>
+          <w:rFonts w:ascii="Times New Roman" w:hAnsi="Times New Roman" w:cs="Times New Roman"/>
+          <w:bCs/>
+          <w:sz w:val="24"/>
+          <w:szCs w:val="24"/>
+        </w:rPr>
+        <w:t>.</w:t>
+      </w:r>
+    </w:p>
+    <w:p>
+      <w:pPr>
+        <w:spacing w:line="276" w:lineRule="auto"/>
+        <w:jc w:val="both"/>
+        <w:rPr>
+          <w:rFonts w:ascii="Times New Roman" w:hAnsi="Times New Roman" w:cs="Times New Roman"/>
+          <w:bCs/>
+          <w:sz w:val="24"/>
+          <w:szCs w:val="24"/>
+        </w:rPr>
+      </w:pPr>
+      <w:bookmarkStart w:id="5" w:name="_Hlk134555465"/>
+      <w:r>
+        <w:rPr>
+          <w:rFonts w:ascii="Times New Roman" w:hAnsi="Times New Roman" w:cs="Times New Roman"/>
+          <w:bCs/>
+          <w:sz w:val="24"/>
+          <w:szCs w:val="24"/>
+        </w:rPr>
+        <w:t>Revue de la littérature :</w:t>
+      </w:r>
+    </w:p>
+    <w:p>
+      <w:pPr>
+        <w:spacing w:line="276" w:lineRule="auto"/>
+        <w:jc w:val="both"/>
+        <w:rPr>
+          <w:rFonts w:ascii="Times New Roman" w:hAnsi="Times New Roman" w:cs="Times New Roman"/>
+          <w:bCs/>
+          <w:sz w:val="24"/>
+          <w:szCs w:val="24"/>
+        </w:rPr>
+      </w:pPr>
+      <w:bookmarkStart w:id="6" w:name="_Hlk134555489"/>
       <w:bookmarkEnd w:id="5"/>
       <w:r>
         <w:rPr>
@@ -5702,127 +5909,8 @@
           <w:sz w:val="24"/>
           <w:szCs w:val="24"/>
         </w:rPr>
-        <w:t>(TCPIBRtete)</w:t>
-      </w:r>
-    </w:p>
-    <w:p>
-      <w:pPr>
-        <w:spacing w:line="276" w:lineRule="auto"/>
-        <w:jc w:val="both"/>
-        <w:rPr>
-          <w:rFonts w:ascii="Times New Roman" w:hAnsi="Times New Roman" w:cs="Times New Roman"/>
-          <w:bCs/>
-          <w:sz w:val="24"/>
-          <w:szCs w:val="24"/>
-        </w:rPr>
-      </w:pPr>
-      <w:r>
-        <w:rPr>
-          <w:rFonts w:ascii="Times New Roman" w:hAnsi="Times New Roman" w:cs="Times New Roman"/>
-          <w:bCs/>
-          <w:sz w:val="24"/>
-          <w:szCs w:val="24"/>
-        </w:rPr>
-        <w:t>Variables indépendantes : Taux de croissance annuelle par population (TC</w:t>
-      </w:r>
-      <w:r>
-        <w:rPr>
-          <w:rFonts w:ascii="Times New Roman" w:hAnsi="Times New Roman" w:cs="Times New Roman"/>
-          <w:bCs/>
-          <w:sz w:val="24"/>
-          <w:szCs w:val="24"/>
-        </w:rPr>
-        <w:t>A</w:t>
-      </w:r>
-      <w:r>
-        <w:rPr>
-          <w:rFonts w:ascii="Times New Roman" w:hAnsi="Times New Roman" w:cs="Times New Roman"/>
-          <w:bCs/>
-          <w:sz w:val="24"/>
-          <w:szCs w:val="24"/>
-        </w:rPr>
-        <w:t xml:space="preserve">nnPop), la part de l’Exportation </w:t>
-      </w:r>
-      <w:r>
-        <w:rPr>
-          <w:rFonts w:ascii="Times New Roman" w:hAnsi="Times New Roman" w:cs="Times New Roman"/>
-          <w:bCs/>
-          <w:sz w:val="24"/>
-          <w:szCs w:val="24"/>
-        </w:rPr>
-        <w:t>sur</w:t>
-      </w:r>
-      <w:r>
-        <w:rPr>
-          <w:rFonts w:ascii="Times New Roman" w:hAnsi="Times New Roman" w:cs="Times New Roman"/>
-          <w:bCs/>
-          <w:sz w:val="24"/>
-          <w:szCs w:val="24"/>
-        </w:rPr>
-        <w:t xml:space="preserve"> le </w:t>
-      </w:r>
-      <w:r>
-        <w:rPr>
-          <w:rFonts w:ascii="Times New Roman" w:hAnsi="Times New Roman" w:cs="Times New Roman"/>
-          <w:bCs/>
-          <w:sz w:val="24"/>
-          <w:szCs w:val="24"/>
-        </w:rPr>
-        <w:t>PIB (</w:t>
-      </w:r>
-      <w:r>
-        <w:rPr>
-          <w:rFonts w:ascii="Times New Roman" w:hAnsi="Times New Roman" w:cs="Times New Roman"/>
-          <w:bCs/>
-          <w:sz w:val="24"/>
-          <w:szCs w:val="24"/>
-        </w:rPr>
-        <w:t>EXPPIB)</w:t>
-      </w:r>
-      <w:r>
-        <w:rPr>
-          <w:rFonts w:ascii="Times New Roman" w:hAnsi="Times New Roman" w:cs="Times New Roman"/>
-          <w:bCs/>
-          <w:sz w:val="24"/>
-          <w:szCs w:val="24"/>
-        </w:rPr>
-        <w:t>.</w:t>
-      </w:r>
-    </w:p>
-    <w:p>
-      <w:pPr>
-        <w:spacing w:line="276" w:lineRule="auto"/>
-        <w:jc w:val="both"/>
-        <w:rPr>
-          <w:rFonts w:ascii="Times New Roman" w:hAnsi="Times New Roman" w:cs="Times New Roman"/>
-          <w:bCs/>
-          <w:sz w:val="24"/>
-          <w:szCs w:val="24"/>
-        </w:rPr>
-      </w:pPr>
-      <w:bookmarkStart w:id="6" w:name="_Hlk134555465"/>
-      <w:r>
-        <w:rPr>
-          <w:rFonts w:ascii="Times New Roman" w:hAnsi="Times New Roman" w:cs="Times New Roman"/>
-          <w:bCs/>
-          <w:sz w:val="24"/>
-          <w:szCs w:val="24"/>
-        </w:rPr>
-        <w:t>Revue de la littérature :</w:t>
-      </w:r>
-    </w:p>
-    <w:p>
-      <w:pPr>
-        <w:spacing w:line="276" w:lineRule="auto"/>
-        <w:jc w:val="both"/>
-        <w:rPr>
-          <w:rFonts w:ascii="Times New Roman" w:hAnsi="Times New Roman" w:cs="Times New Roman"/>
-          <w:bCs/>
-          <w:sz w:val="24"/>
-          <w:szCs w:val="24"/>
-        </w:rPr>
-      </w:pPr>
-      <w:bookmarkStart w:id="7" w:name="_Hlk134555489"/>
+        <w:t>L’auteur :</w:t>
+      </w:r>
       <w:bookmarkEnd w:id="6"/>
       <w:r>
         <w:rPr>
@@ -5831,72 +5919,62 @@
           <w:sz w:val="24"/>
           <w:szCs w:val="24"/>
         </w:rPr>
-        <w:t>L’auteur :</w:t>
+        <w:t xml:space="preserve"> </w:t>
+      </w:r>
+      <w:proofErr w:type="spellStart"/>
+      <w:r>
+        <w:rPr>
+          <w:rFonts w:ascii="Times New Roman" w:hAnsi="Times New Roman" w:cs="Times New Roman"/>
+          <w:bCs/>
+          <w:sz w:val="24"/>
+          <w:szCs w:val="24"/>
+        </w:rPr>
+        <w:t>Palakiyèm</w:t>
+      </w:r>
+      <w:proofErr w:type="spellEnd"/>
+      <w:r>
+        <w:rPr>
+          <w:rFonts w:ascii="Times New Roman" w:hAnsi="Times New Roman" w:cs="Times New Roman"/>
+          <w:bCs/>
+          <w:sz w:val="24"/>
+          <w:szCs w:val="24"/>
+        </w:rPr>
+        <w:t xml:space="preserve"> </w:t>
+      </w:r>
+      <w:proofErr w:type="spellStart"/>
+      <w:r>
+        <w:rPr>
+          <w:rFonts w:ascii="Times New Roman" w:hAnsi="Times New Roman" w:cs="Times New Roman"/>
+          <w:bCs/>
+          <w:sz w:val="24"/>
+          <w:szCs w:val="24"/>
+        </w:rPr>
+        <w:t>Kpemoua</w:t>
+      </w:r>
+      <w:proofErr w:type="spellEnd"/>
+    </w:p>
+    <w:p>
+      <w:pPr>
+        <w:spacing w:line="276" w:lineRule="auto"/>
+        <w:jc w:val="both"/>
+        <w:rPr>
+          <w:rFonts w:ascii="Times New Roman" w:hAnsi="Times New Roman" w:cs="Times New Roman"/>
+          <w:bCs/>
+          <w:sz w:val="24"/>
+          <w:szCs w:val="24"/>
+        </w:rPr>
+      </w:pPr>
+      <w:bookmarkStart w:id="7" w:name="_Hlk134555556"/>
+      <w:r>
+        <w:rPr>
+          <w:rFonts w:ascii="Times New Roman" w:hAnsi="Times New Roman" w:cs="Times New Roman"/>
+          <w:bCs/>
+          <w:sz w:val="24"/>
+          <w:szCs w:val="24"/>
+        </w:rPr>
+        <w:t>Thème :</w:t>
       </w:r>
       <w:bookmarkEnd w:id="7"/>
-      <w:r>
-        <w:rPr>
-          <w:rFonts w:ascii="Times New Roman" w:hAnsi="Times New Roman" w:cs="Times New Roman"/>
-          <w:bCs/>
-          <w:sz w:val="24"/>
-          <w:szCs w:val="24"/>
-        </w:rPr>
-        <w:t xml:space="preserve"> </w:t>
-      </w:r>
-      <w:proofErr w:type="spellStart"/>
-      <w:r>
-        <w:rPr>
-          <w:rFonts w:ascii="Times New Roman" w:hAnsi="Times New Roman" w:cs="Times New Roman"/>
-          <w:bCs/>
-          <w:sz w:val="24"/>
-          <w:szCs w:val="24"/>
-        </w:rPr>
-        <w:t>Palakiyèm</w:t>
-      </w:r>
-      <w:proofErr w:type="spellEnd"/>
-      <w:r>
-        <w:rPr>
-          <w:rFonts w:ascii="Times New Roman" w:hAnsi="Times New Roman" w:cs="Times New Roman"/>
-          <w:bCs/>
-          <w:sz w:val="24"/>
-          <w:szCs w:val="24"/>
-        </w:rPr>
-        <w:t xml:space="preserve"> </w:t>
-      </w:r>
-      <w:proofErr w:type="spellStart"/>
-      <w:r>
-        <w:rPr>
-          <w:rFonts w:ascii="Times New Roman" w:hAnsi="Times New Roman" w:cs="Times New Roman"/>
-          <w:bCs/>
-          <w:sz w:val="24"/>
-          <w:szCs w:val="24"/>
-        </w:rPr>
-        <w:t>Kpemoua</w:t>
-      </w:r>
-      <w:proofErr w:type="spellEnd"/>
-    </w:p>
-    <w:p>
-      <w:pPr>
-        <w:spacing w:line="276" w:lineRule="auto"/>
-        <w:jc w:val="both"/>
-        <w:rPr>
-          <w:rFonts w:ascii="Times New Roman" w:hAnsi="Times New Roman" w:cs="Times New Roman"/>
-          <w:bCs/>
-          <w:sz w:val="24"/>
-          <w:szCs w:val="24"/>
-        </w:rPr>
-      </w:pPr>
-      <w:bookmarkStart w:id="8" w:name="_Hlk134555556"/>
-      <w:r>
-        <w:rPr>
-          <w:rFonts w:ascii="Times New Roman" w:hAnsi="Times New Roman" w:cs="Times New Roman"/>
-          <w:bCs/>
-          <w:sz w:val="24"/>
-          <w:szCs w:val="24"/>
-        </w:rPr>
-        <w:t>Thème :</w:t>
-      </w:r>
-      <w:bookmarkEnd w:id="8"/>
       <w:r>
         <w:rPr>
           <w:rFonts w:ascii="Times New Roman" w:hAnsi="Times New Roman" w:cs="Times New Roman"/>
@@ -6129,7 +6207,7 @@
       <w:proofErr w:type="spellEnd"/>
       <w:proofErr w:type="gramEnd"/>
     </w:p>
-    <w:bookmarkEnd w:id="4"/>
+    <w:bookmarkEnd w:id="3"/>
     <w:p>
       <w:pPr>
         <w:spacing w:line="276" w:lineRule="auto"/>
@@ -6616,7 +6694,7 @@
           <w:szCs w:val="28"/>
         </w:rPr>
       </w:pPr>
-      <w:bookmarkStart w:id="9" w:name="_Toc134556626"/>
+      <w:bookmarkStart w:id="8" w:name="_Toc134556626"/>
       <w:r>
         <w:rPr>
           <w:rStyle w:val="Titre1Car"/>
@@ -6630,7 +6708,7 @@
         <w:lastRenderedPageBreak/>
         <w:t>Analyse univariée</w:t>
       </w:r>
-      <w:bookmarkEnd w:id="9"/>
+      <w:bookmarkEnd w:id="8"/>
       <w:r>
         <w:rPr>
           <w:rStyle w:val="Titre1Car"/>
@@ -6661,6 +6739,7 @@
           <w:numId w:val="26"/>
         </w:numPr>
         <w:spacing w:line="276" w:lineRule="auto"/>
+        <w:jc w:val="both"/>
         <w:rPr>
           <w:rFonts w:ascii="Times New Roman" w:hAnsi="Times New Roman" w:cs="Times New Roman"/>
           <w:b/>
@@ -6669,7 +6748,7 @@
           <w:szCs w:val="24"/>
         </w:rPr>
       </w:pPr>
-      <w:bookmarkStart w:id="10" w:name="_Toc134556627"/>
+      <w:bookmarkStart w:id="9" w:name="_Toc134556627"/>
       <w:r>
         <w:rPr>
           <w:rFonts w:ascii="Times New Roman" w:hAnsi="Times New Roman" w:cs="Times New Roman"/>
@@ -6769,7 +6848,7 @@
         </w:rPr>
         <w:t xml:space="preserve"> paraissent pertinentes</w:t>
       </w:r>
-      <w:bookmarkEnd w:id="10"/>
+      <w:bookmarkEnd w:id="9"/>
     </w:p>
     <w:p>
       <w:pPr>
@@ -6814,6 +6893,7 @@
         <w:pStyle w:val="Lgende"/>
         <w:keepNext/>
         <w:spacing w:line="276" w:lineRule="auto"/>
+        <w:jc w:val="both"/>
         <w:rPr>
           <w:rFonts w:ascii="Times New Roman" w:hAnsi="Times New Roman" w:cs="Times New Roman"/>
           <w:i w:val="0"/>
@@ -6823,8 +6903,8 @@
           <w:szCs w:val="24"/>
         </w:rPr>
       </w:pPr>
-      <w:bookmarkStart w:id="11" w:name="_Toc134556654"/>
-      <w:bookmarkStart w:id="12" w:name="_Hlk134556098"/>
+      <w:bookmarkStart w:id="10" w:name="_Toc134556654"/>
+      <w:bookmarkStart w:id="11" w:name="_Hlk134556098"/>
       <w:r>
         <w:rPr>
           <w:rFonts w:ascii="Times New Roman" w:hAnsi="Times New Roman" w:cs="Times New Roman"/>
@@ -6862,7 +6942,7 @@
         </w:rPr>
         <w:t xml:space="preserve">: paramètres descriptifs </w:t>
       </w:r>
-      <w:bookmarkEnd w:id="11"/>
+      <w:bookmarkEnd w:id="10"/>
     </w:p>
     <w:tbl>
       <w:tblPr>
@@ -6883,7 +6963,7 @@
           <w:tcPr>
             <w:tcW w:w="1510" w:type="dxa"/>
           </w:tcPr>
-          <w:bookmarkEnd w:id="12"/>
+          <w:bookmarkEnd w:id="11"/>
           <w:p>
             <w:pPr>
               <w:spacing w:line="276" w:lineRule="auto"/>
@@ -7249,7 +7329,7 @@
           <w:szCs w:val="24"/>
         </w:rPr>
       </w:pPr>
-      <w:bookmarkStart w:id="13" w:name="_Hlk134553154"/>
+      <w:bookmarkStart w:id="12" w:name="_Hlk134553154"/>
     </w:p>
     <w:p>
       <w:pPr>
@@ -7289,7 +7369,7 @@
         </w:rPr>
         <w:t xml:space="preserve"> a un </w:t>
       </w:r>
-      <w:bookmarkStart w:id="14" w:name="_Hlk134556164"/>
+      <w:bookmarkStart w:id="13" w:name="_Hlk134556164"/>
       <w:r>
         <w:rPr>
           <w:rFonts w:ascii="Times New Roman" w:hAnsi="Times New Roman" w:cs="Times New Roman"/>
@@ -7299,7 +7379,7 @@
         </w:rPr>
         <w:t>Taux de croissance du PIB par tête</w:t>
       </w:r>
-      <w:bookmarkEnd w:id="14"/>
+      <w:bookmarkEnd w:id="13"/>
       <w:r>
         <w:rPr>
           <w:rFonts w:ascii="Times New Roman" w:hAnsi="Times New Roman" w:cs="Times New Roman"/>
@@ -7456,6 +7536,7 @@
           <w:numId w:val="26"/>
         </w:numPr>
         <w:spacing w:line="276" w:lineRule="auto"/>
+        <w:jc w:val="both"/>
         <w:rPr>
           <w:rFonts w:ascii="Times New Roman" w:hAnsi="Times New Roman" w:cs="Times New Roman"/>
           <w:color w:val="auto"/>
@@ -7463,8 +7544,8 @@
           <w:szCs w:val="24"/>
         </w:rPr>
       </w:pPr>
-      <w:bookmarkStart w:id="15" w:name="_Toc134556628"/>
-      <w:bookmarkEnd w:id="13"/>
+      <w:bookmarkStart w:id="14" w:name="_Toc134556628"/>
+      <w:bookmarkEnd w:id="12"/>
       <w:r>
         <w:rPr>
           <w:rFonts w:ascii="Times New Roman" w:hAnsi="Times New Roman" w:cs="Times New Roman"/>
@@ -7546,7 +7627,7 @@
         </w:rPr>
         <w:t xml:space="preserve"> paraissent pertinentes</w:t>
       </w:r>
-      <w:bookmarkEnd w:id="15"/>
+      <w:bookmarkEnd w:id="14"/>
     </w:p>
     <w:p>
       <w:pPr>
@@ -7643,6 +7724,7 @@
         <w:pStyle w:val="Lgende"/>
         <w:keepNext/>
         <w:spacing w:line="276" w:lineRule="auto"/>
+        <w:jc w:val="both"/>
         <w:rPr>
           <w:rFonts w:ascii="Times New Roman" w:hAnsi="Times New Roman" w:cs="Times New Roman"/>
           <w:b/>
@@ -7654,7 +7736,7 @@
           <w:szCs w:val="24"/>
         </w:rPr>
       </w:pPr>
-      <w:bookmarkStart w:id="16" w:name="_Toc134556655"/>
+      <w:bookmarkStart w:id="15" w:name="_Toc134556655"/>
       <w:r>
         <w:rPr>
           <w:rFonts w:ascii="Times New Roman" w:hAnsi="Times New Roman" w:cs="Times New Roman"/>
@@ -7718,7 +7800,7 @@
         </w:rPr>
         <w:t xml:space="preserve"> </w:t>
       </w:r>
-      <w:bookmarkEnd w:id="16"/>
+      <w:bookmarkEnd w:id="15"/>
     </w:p>
     <w:tbl>
       <w:tblPr>
@@ -8131,6 +8213,7 @@
         <w:pStyle w:val="Lgende"/>
         <w:keepNext/>
         <w:spacing w:line="276" w:lineRule="auto"/>
+        <w:jc w:val="both"/>
         <w:rPr>
           <w:rFonts w:ascii="Times New Roman" w:hAnsi="Times New Roman" w:cs="Times New Roman"/>
           <w:b/>
@@ -8142,7 +8225,7 @@
           <w:szCs w:val="24"/>
         </w:rPr>
       </w:pPr>
-      <w:bookmarkStart w:id="17" w:name="_Toc134556656"/>
+      <w:bookmarkStart w:id="16" w:name="_Toc134556656"/>
       <w:r>
         <w:rPr>
           <w:rFonts w:ascii="Times New Roman" w:hAnsi="Times New Roman" w:cs="Times New Roman"/>
@@ -8193,7 +8276,7 @@
         </w:rPr>
         <w:t xml:space="preserve">paramètres descriptifs </w:t>
       </w:r>
-      <w:bookmarkEnd w:id="17"/>
+      <w:bookmarkEnd w:id="16"/>
     </w:p>
     <w:tbl>
       <w:tblPr>
@@ -8603,6 +8686,7 @@
         <w:pStyle w:val="Lgende"/>
         <w:keepNext/>
         <w:spacing w:line="276" w:lineRule="auto"/>
+        <w:jc w:val="both"/>
         <w:rPr>
           <w:rFonts w:ascii="Times New Roman" w:hAnsi="Times New Roman" w:cs="Times New Roman"/>
           <w:i w:val="0"/>
@@ -8612,7 +8696,7 @@
           <w:szCs w:val="24"/>
         </w:rPr>
       </w:pPr>
-      <w:bookmarkStart w:id="18" w:name="_Toc134556658"/>
+      <w:bookmarkStart w:id="17" w:name="_Toc134556658"/>
       <w:r>
         <w:rPr>
           <w:rFonts w:ascii="Times New Roman" w:hAnsi="Times New Roman" w:cs="Times New Roman"/>
@@ -8683,7 +8767,7 @@
         </w:rPr>
         <w:t>s</w:t>
       </w:r>
-      <w:bookmarkEnd w:id="18"/>
+      <w:bookmarkEnd w:id="17"/>
     </w:p>
     <w:tbl>
       <w:tblPr>
@@ -9130,6 +9214,7 @@
         <w:pStyle w:val="Lgende"/>
         <w:keepNext/>
         <w:spacing w:line="276" w:lineRule="auto"/>
+        <w:jc w:val="both"/>
         <w:rPr>
           <w:rFonts w:ascii="Times New Roman" w:hAnsi="Times New Roman" w:cs="Times New Roman"/>
           <w:i w:val="0"/>
@@ -9139,7 +9224,7 @@
           <w:szCs w:val="24"/>
         </w:rPr>
       </w:pPr>
-      <w:bookmarkStart w:id="19" w:name="_Toc134556659"/>
+      <w:bookmarkStart w:id="18" w:name="_Toc134556659"/>
       <w:r>
         <w:rPr>
           <w:rFonts w:ascii="Times New Roman" w:hAnsi="Times New Roman" w:cs="Times New Roman"/>
@@ -9221,7 +9306,7 @@
         </w:rPr>
         <w:t xml:space="preserve"> </w:t>
       </w:r>
-      <w:bookmarkEnd w:id="19"/>
+      <w:bookmarkEnd w:id="18"/>
     </w:p>
     <w:tbl>
       <w:tblPr>
@@ -9602,23 +9687,14 @@
         <w:jc w:val="both"/>
         <w:rPr>
           <w:rFonts w:ascii="Times New Roman" w:hAnsi="Times New Roman" w:cs="Times New Roman"/>
-          <w:sz w:val="24"/>
-          <w:szCs w:val="24"/>
-        </w:rPr>
-      </w:pPr>
-      <w:bookmarkStart w:id="20" w:name="_Hlk134553275"/>
-    </w:p>
-    <w:p>
-      <w:pPr>
-        <w:spacing w:line="276" w:lineRule="auto"/>
-        <w:jc w:val="both"/>
-        <w:rPr>
-          <w:rFonts w:ascii="Times New Roman" w:hAnsi="Times New Roman" w:cs="Times New Roman"/>
-          <w:bCs/>
-          <w:sz w:val="24"/>
-          <w:szCs w:val="24"/>
-        </w:rPr>
-      </w:pPr>
+          <w:bCs/>
+          <w:sz w:val="24"/>
+          <w:szCs w:val="24"/>
+        </w:rPr>
+      </w:pPr>
+      <w:bookmarkStart w:id="19" w:name="_Hlk134553275"/>
+      <w:bookmarkStart w:id="20" w:name="_GoBack"/>
+      <w:bookmarkEnd w:id="20"/>
       <w:r>
         <w:rPr>
           <w:rFonts w:ascii="Times New Roman" w:hAnsi="Times New Roman" w:cs="Times New Roman"/>
@@ -9864,7 +9940,7 @@
         <w:t xml:space="preserve">. </w:t>
       </w:r>
       <w:bookmarkStart w:id="21" w:name="_Hlk134555948"/>
-      <w:bookmarkEnd w:id="20"/>
+      <w:bookmarkEnd w:id="19"/>
       <w:r>
         <w:rPr>
           <w:rFonts w:ascii="Times New Roman" w:hAnsi="Times New Roman" w:cs="Times New Roman"/>
@@ -10068,6 +10144,7 @@
           <w:numId w:val="26"/>
         </w:numPr>
         <w:spacing w:line="276" w:lineRule="auto"/>
+        <w:jc w:val="both"/>
         <w:rPr>
           <w:rFonts w:ascii="Times New Roman" w:hAnsi="Times New Roman" w:cs="Times New Roman"/>
           <w:color w:val="auto"/>
@@ -10284,8 +10361,8 @@
         </w:rPr>
         <w:drawing>
           <wp:inline distT="0" distB="0" distL="0" distR="0">
-            <wp:extent cx="4468091" cy="1953260"/>
-            <wp:effectExtent l="0" t="0" r="8890" b="8890"/>
+            <wp:extent cx="5592376" cy="2444750"/>
+            <wp:effectExtent l="0" t="0" r="0" b="0"/>
             <wp:docPr id="1180512818" name="Image 3"/>
             <wp:cNvGraphicFramePr>
               <a:graphicFrameLocks xmlns:a="http://schemas.openxmlformats.org/drawingml/2006/main" noChangeAspect="1"/>
@@ -10315,7 +10392,7 @@
                   <pic:spPr bwMode="auto">
                     <a:xfrm>
                       <a:off x="0" y="0"/>
-                      <a:ext cx="4481954" cy="1959320"/>
+                      <a:ext cx="5641694" cy="2466310"/>
                     </a:xfrm>
                     <a:prstGeom prst="rect">
                       <a:avLst/>
@@ -10689,6 +10766,7 @@
           <w:numId w:val="26"/>
         </w:numPr>
         <w:spacing w:line="276" w:lineRule="auto"/>
+        <w:jc w:val="both"/>
         <w:rPr>
           <w:rFonts w:ascii="Times New Roman" w:hAnsi="Times New Roman" w:cs="Times New Roman"/>
           <w:color w:val="auto"/>
@@ -10846,8 +10924,8 @@
         </w:rPr>
         <w:drawing>
           <wp:inline distT="0" distB="0" distL="0" distR="0">
-            <wp:extent cx="4551045" cy="1863436"/>
-            <wp:effectExtent l="0" t="0" r="1905" b="3810"/>
+            <wp:extent cx="4900689" cy="2006600"/>
+            <wp:effectExtent l="0" t="0" r="0" b="0"/>
             <wp:docPr id="167280703" name="Image 4"/>
             <wp:cNvGraphicFramePr>
               <a:graphicFrameLocks xmlns:a="http://schemas.openxmlformats.org/drawingml/2006/main" noChangeAspect="1"/>
@@ -10877,7 +10955,7 @@
                   <pic:spPr bwMode="auto">
                     <a:xfrm>
                       <a:off x="0" y="0"/>
-                      <a:ext cx="4571625" cy="1871863"/>
+                      <a:ext cx="4971267" cy="2035498"/>
                     </a:xfrm>
                     <a:prstGeom prst="rect">
                       <a:avLst/>
@@ -10904,17 +10982,6 @@
           <w:szCs w:val="24"/>
         </w:rPr>
       </w:pPr>
-    </w:p>
-    <w:p>
-      <w:pPr>
-        <w:spacing w:line="276" w:lineRule="auto"/>
-        <w:jc w:val="both"/>
-        <w:rPr>
-          <w:rFonts w:ascii="Times New Roman" w:hAnsi="Times New Roman" w:cs="Times New Roman"/>
-          <w:sz w:val="24"/>
-          <w:szCs w:val="24"/>
-        </w:rPr>
-      </w:pPr>
       <w:r>
         <w:rPr>
           <w:rFonts w:ascii="Times New Roman" w:hAnsi="Times New Roman" w:cs="Times New Roman"/>
@@ -11085,6 +11152,7 @@
           <w:numId w:val="26"/>
         </w:numPr>
         <w:spacing w:line="276" w:lineRule="auto"/>
+        <w:jc w:val="both"/>
         <w:rPr>
           <w:rFonts w:ascii="Times New Roman" w:hAnsi="Times New Roman" w:cs="Times New Roman"/>
           <w:color w:val="auto"/>
@@ -11208,6 +11276,7 @@
     <w:p>
       <w:pPr>
         <w:spacing w:line="276" w:lineRule="auto"/>
+        <w:jc w:val="both"/>
         <w:rPr>
           <w:rFonts w:ascii="Times New Roman" w:hAnsi="Times New Roman" w:cs="Times New Roman"/>
           <w:sz w:val="24"/>
@@ -11226,6 +11295,7 @@
     <w:p>
       <w:pPr>
         <w:spacing w:line="276" w:lineRule="auto"/>
+        <w:jc w:val="both"/>
         <w:rPr>
           <w:rFonts w:ascii="Times New Roman" w:hAnsi="Times New Roman" w:cs="Times New Roman"/>
           <w:i/>
@@ -12149,6 +12219,7 @@
           <w:numId w:val="26"/>
         </w:numPr>
         <w:spacing w:line="276" w:lineRule="auto"/>
+        <w:jc w:val="both"/>
         <w:rPr>
           <w:rFonts w:ascii="Times New Roman" w:hAnsi="Times New Roman" w:cs="Times New Roman"/>
           <w:color w:val="auto"/>
@@ -13325,6 +13396,7 @@
           <w:numId w:val="15"/>
         </w:numPr>
         <w:spacing w:line="276" w:lineRule="auto"/>
+        <w:jc w:val="both"/>
         <w:rPr>
           <w:b/>
           <w:bCs/>
@@ -13369,6 +13441,7 @@
           <w:numId w:val="26"/>
         </w:numPr>
         <w:spacing w:line="276" w:lineRule="auto"/>
+        <w:jc w:val="both"/>
         <w:rPr>
           <w:rFonts w:ascii="Times New Roman" w:hAnsi="Times New Roman" w:cs="Times New Roman"/>
           <w:b/>
@@ -13951,6 +14024,7 @@
           <w:numId w:val="26"/>
         </w:numPr>
         <w:spacing w:line="276" w:lineRule="auto"/>
+        <w:jc w:val="both"/>
         <w:rPr>
           <w:rFonts w:ascii="Times New Roman" w:hAnsi="Times New Roman" w:cs="Times New Roman"/>
           <w:color w:val="auto"/>
@@ -13966,7 +14040,6 @@
           <w:sz w:val="24"/>
           <w:szCs w:val="24"/>
         </w:rPr>
-        <w:lastRenderedPageBreak/>
         <w:t>En regroupant tous les pays, représent</w:t>
       </w:r>
       <w:r>
@@ -14235,8 +14308,8 @@
         </w:rPr>
         <w:drawing>
           <wp:inline distT="0" distB="0" distL="0" distR="0">
-            <wp:extent cx="4015154" cy="2265034"/>
-            <wp:effectExtent l="0" t="0" r="4445" b="2540"/>
+            <wp:extent cx="6102350" cy="1937385"/>
+            <wp:effectExtent l="0" t="0" r="0" b="5715"/>
             <wp:docPr id="704673169" name="Image 6"/>
             <wp:cNvGraphicFramePr>
               <a:graphicFrameLocks xmlns:a="http://schemas.openxmlformats.org/drawingml/2006/main" noChangeAspect="1"/>
@@ -14266,7 +14339,7 @@
                   <pic:spPr bwMode="auto">
                     <a:xfrm>
                       <a:off x="0" y="0"/>
-                      <a:ext cx="4072035" cy="2297122"/>
+                      <a:ext cx="6251590" cy="1984766"/>
                     </a:xfrm>
                     <a:prstGeom prst="rect">
                       <a:avLst/>
@@ -14459,8 +14532,8 @@
         </w:rPr>
         <w:drawing>
           <wp:inline distT="0" distB="0" distL="0" distR="0">
-            <wp:extent cx="4530090" cy="1928446"/>
-            <wp:effectExtent l="0" t="0" r="3810" b="0"/>
+            <wp:extent cx="6036450" cy="2038350"/>
+            <wp:effectExtent l="0" t="0" r="0" b="0"/>
             <wp:docPr id="1409366506" name="Image 7"/>
             <wp:cNvGraphicFramePr>
               <a:graphicFrameLocks xmlns:a="http://schemas.openxmlformats.org/drawingml/2006/main" noChangeAspect="1"/>
@@ -14490,7 +14563,7 @@
                   <pic:spPr bwMode="auto">
                     <a:xfrm>
                       <a:off x="0" y="0"/>
-                      <a:ext cx="4549840" cy="1936854"/>
+                      <a:ext cx="6155019" cy="2078388"/>
                     </a:xfrm>
                     <a:prstGeom prst="rect">
                       <a:avLst/>
@@ -14515,6 +14588,7 @@
           <w:numId w:val="15"/>
         </w:numPr>
         <w:spacing w:line="276" w:lineRule="auto"/>
+        <w:jc w:val="both"/>
         <w:rPr>
           <w:b/>
           <w:bCs/>
@@ -14559,6 +14633,7 @@
           <w:numId w:val="21"/>
         </w:numPr>
         <w:spacing w:line="276" w:lineRule="auto"/>
+        <w:jc w:val="both"/>
         <w:rPr>
           <w:rFonts w:ascii="Times New Roman" w:hAnsi="Times New Roman" w:cs="Times New Roman"/>
           <w:color w:val="auto"/>
@@ -14586,6 +14661,7 @@
           <w:numId w:val="26"/>
         </w:numPr>
         <w:spacing w:line="276" w:lineRule="auto"/>
+        <w:jc w:val="both"/>
         <w:rPr>
           <w:rFonts w:ascii="Times New Roman" w:hAnsi="Times New Roman" w:cs="Times New Roman"/>
           <w:color w:val="auto"/>
@@ -14999,7 +15075,6 @@
           <w:sz w:val="24"/>
           <w:szCs w:val="24"/>
         </w:rPr>
-        <w:lastRenderedPageBreak/>
         <w:t>dfuller</w:t>
       </w:r>
       <w:proofErr w:type="spellEnd"/>
@@ -15202,6 +15277,7 @@
           <w:sz w:val="24"/>
           <w:szCs w:val="24"/>
         </w:rPr>
+        <w:lastRenderedPageBreak/>
         <w:t>Variable</w:t>
       </w:r>
       <w:bookmarkStart w:id="41" w:name="_Hlk134556597"/>
@@ -15444,6 +15520,7 @@
           <w:numId w:val="26"/>
         </w:numPr>
         <w:spacing w:line="276" w:lineRule="auto"/>
+        <w:jc w:val="both"/>
         <w:rPr>
           <w:rFonts w:ascii="Times New Roman" w:hAnsi="Times New Roman" w:cs="Times New Roman"/>
           <w:color w:val="auto"/>
@@ -16717,6 +16794,7 @@
           <w:numId w:val="26"/>
         </w:numPr>
         <w:spacing w:line="276" w:lineRule="auto"/>
+        <w:jc w:val="both"/>
         <w:rPr>
           <w:rFonts w:ascii="Times New Roman" w:hAnsi="Times New Roman" w:cs="Times New Roman"/>
           <w:color w:val="auto"/>
@@ -16732,7 +16810,6 @@
           <w:sz w:val="24"/>
           <w:szCs w:val="24"/>
         </w:rPr>
-        <w:lastRenderedPageBreak/>
         <w:t>Étudi</w:t>
       </w:r>
       <w:r>
@@ -16839,6 +16916,7 @@
           <w:numId w:val="26"/>
         </w:numPr>
         <w:spacing w:line="276" w:lineRule="auto"/>
+        <w:jc w:val="both"/>
         <w:rPr>
           <w:rFonts w:ascii="Times New Roman" w:hAnsi="Times New Roman" w:cs="Times New Roman"/>
           <w:color w:val="auto"/>
@@ -16943,6 +17021,7 @@
           <w:sz w:val="24"/>
           <w:szCs w:val="24"/>
         </w:rPr>
+        <w:lastRenderedPageBreak/>
         <w:t>sktest</w:t>
       </w:r>
       <w:proofErr w:type="spellEnd"/>
@@ -17584,6 +17663,7 @@
           <w:numId w:val="21"/>
         </w:numPr>
         <w:spacing w:line="276" w:lineRule="auto"/>
+        <w:jc w:val="both"/>
         <w:rPr>
           <w:rFonts w:ascii="Times New Roman" w:hAnsi="Times New Roman" w:cs="Times New Roman"/>
           <w:color w:val="auto"/>
@@ -17611,6 +17691,7 @@
           <w:numId w:val="26"/>
         </w:numPr>
         <w:spacing w:line="276" w:lineRule="auto"/>
+        <w:jc w:val="both"/>
         <w:rPr>
           <w:rFonts w:ascii="Times New Roman" w:hAnsi="Times New Roman" w:cs="Times New Roman"/>
           <w:sz w:val="24"/>
@@ -17789,6 +17870,7 @@
           <w:numId w:val="26"/>
         </w:numPr>
         <w:spacing w:line="276" w:lineRule="auto"/>
+        <w:jc w:val="both"/>
         <w:rPr>
           <w:rFonts w:ascii="Times New Roman" w:hAnsi="Times New Roman" w:cs="Times New Roman"/>
           <w:color w:val="auto"/>
@@ -17804,7 +17886,6 @@
           <w:sz w:val="24"/>
           <w:szCs w:val="24"/>
         </w:rPr>
-        <w:lastRenderedPageBreak/>
         <w:t>En supposant qu’on doit estimer un modèle à effets individuels, déterminons de manière précise le modèle à estimer</w:t>
       </w:r>
       <w:bookmarkEnd w:id="48"/>
@@ -17956,6 +18037,7 @@
           <w:szCs w:val="24"/>
           <w:lang w:val="en-ZA"/>
         </w:rPr>
+        <w:lastRenderedPageBreak/>
         <w:t>xtreg</w:t>
       </w:r>
       <w:proofErr w:type="spellEnd"/>
@@ -18485,6 +18567,7 @@
       <w:pPr>
         <w:pStyle w:val="Titre1"/>
         <w:spacing w:line="276" w:lineRule="auto"/>
+        <w:jc w:val="both"/>
         <w:rPr>
           <w:rFonts w:ascii="Times New Roman" w:hAnsi="Times New Roman" w:cs="Times New Roman"/>
           <w:b/>
@@ -18504,7 +18587,6 @@
           <w:sz w:val="28"/>
           <w:szCs w:val="28"/>
         </w:rPr>
-        <w:lastRenderedPageBreak/>
         <w:t>Conclusion</w:t>
       </w:r>
       <w:bookmarkEnd w:id="51"/>
@@ -18533,7 +18615,7 @@
     </w:p>
     <w:p>
       <w:pPr>
-        <w:spacing w:line="276" w:lineRule="auto"/>
+        <w:spacing w:before="240" w:line="276" w:lineRule="auto"/>
         <w:jc w:val="both"/>
         <w:rPr>
           <w:rFonts w:ascii="Times New Roman" w:hAnsi="Times New Roman" w:cs="Times New Roman"/>
@@ -18720,6 +18802,7 @@
           <w:sz w:val="24"/>
           <w:szCs w:val="24"/>
         </w:rPr>
+        <w:lastRenderedPageBreak/>
         <w:t>Taux de croissance du PIB par tête est de</w:t>
       </w:r>
       <w:r>
@@ -19890,25 +19973,15 @@
           <w:sz w:val="24"/>
           <w:szCs w:val="24"/>
         </w:rPr>
-        <w:t xml:space="preserve"> Ce qui signifie qu’il </w:t>
-      </w:r>
-      <w:proofErr w:type="gramStart"/>
-      <w:r>
-        <w:rPr>
-          <w:rFonts w:ascii="Times New Roman" w:hAnsi="Times New Roman" w:cs="Times New Roman"/>
-          <w:sz w:val="24"/>
-          <w:szCs w:val="24"/>
-        </w:rPr>
-        <w:t>n y</w:t>
-      </w:r>
-      <w:proofErr w:type="gramEnd"/>
-      <w:r>
-        <w:rPr>
-          <w:rFonts w:ascii="Times New Roman" w:hAnsi="Times New Roman" w:cs="Times New Roman"/>
-          <w:sz w:val="24"/>
-          <w:szCs w:val="24"/>
-        </w:rPr>
-        <w:t xml:space="preserve"> a pas de relation entre le </w:t>
+        <w:t xml:space="preserve"> Ce qui signifie qu’il n’</w:t>
+      </w:r>
+      <w:r>
+        <w:rPr>
+          <w:rFonts w:ascii="Times New Roman" w:hAnsi="Times New Roman" w:cs="Times New Roman"/>
+          <w:sz w:val="24"/>
+          <w:szCs w:val="24"/>
+        </w:rPr>
+        <w:t xml:space="preserve">y a pas de relation entre le </w:t>
       </w:r>
       <w:r>
         <w:rPr>
@@ -24441,7 +24514,7 @@
 </file>
 
 <file path=customXml/itemProps1.xml><?xml version="1.0" encoding="utf-8"?>
-<ds:datastoreItem xmlns:ds="http://schemas.openxmlformats.org/officeDocument/2006/customXml" ds:itemID="{DA064715-A4C7-4564-B521-76D4586499BB}">
+<ds:datastoreItem xmlns:ds="http://schemas.openxmlformats.org/officeDocument/2006/customXml" ds:itemID="{4A4B3DB8-F20A-41E9-B5F7-B364CCCA9719}">
   <ds:schemaRefs>
     <ds:schemaRef ds:uri="http://schemas.openxmlformats.org/officeDocument/2006/bibliography"/>
   </ds:schemaRefs>

</xml_diff>